<commit_message>
Remove Slayer brand mentions from research proposal
Co-Authored-By: Claude Sonnet 4.6 <noreply@anthropic.com>
</commit_message>
<xml_diff>
--- a/The_Brain_Research_Proposal_Etap1 .docx
+++ b/The_Brain_Research_Proposal_Etap1 .docx
@@ -104,7 +104,7 @@
           <w:sz w:val="22"/>
           <w:szCs w:val="22"/>
         </w:rPr>
-        <w:t xml:space="preserve">Wyniki eksperymentu posłużą jako empiryczna podstawa dla kolejnych etapów projektu — w szczególności fine-tuningu modelu pod generowanie żądań HTTP (GET, POST, itp.) z języka naturalnego — a materiał z realizacji eksperymentu stanie się treścią publicznego filmu na YouTube oraz wpisów w polskim community AI Slayer.</w:t>
+        <w:t xml:space="preserve">Wyniki eksperymentu posłużą jako empiryczna podstawa dla kolejnych etapów projektu — w szczególności fine-tuningu modelu pod generowanie żądań HTTP (GET, POST, itp.) z języka naturalnego — a materiał z realizacji eksperymentu stanie się treścią publicznego filmu na YouTube oraz wpisów w polskim community AI.</w:t>
       </w:r>
     </w:p>
     <w:p>
@@ -3041,7 +3041,7 @@
           <w:sz w:val="22"/>
           <w:szCs w:val="22"/>
         </w:rPr>
-        <w:t xml:space="preserve">Wyniki tego etapu, niezależnie od tego czy będą pozytywne czy negatywne, dostarczą solidnej empirycznej podstawy dla decyzji o kierunku Etapu 2 oraz będą wartościowym materiałem dla polskiej społeczności AI (community Slayer) i szerszej publiczności na YouTube.</w:t>
+        <w:t xml:space="preserve">Wyniki tego etapu, niezależnie od tego czy będą pozytywne czy negatywne, dostarczą solidnej empirycznej podstawy dla decyzji o kierunku Etapu 2 oraz będą wartościowym materiałem dla polskiej społeczności AI i szerszej publiczności na YouTube.</w:t>
       </w:r>
     </w:p>
     <w:p>

</xml_diff>